<commit_message>
refactor(evidence): depurar imagenes residuales, estandarizar numeracion 01-14 y estructurar semana_2
</commit_message>
<xml_diff>
--- a/docs/13_Evidencia_Cumplimiento_Requerimientos_Software.docx
+++ b/docs/13_Evidencia_Cumplimiento_Requerimientos_Software.docx
@@ -1057,7 +1057,7 @@
           <w:color w:val="1E293B"/>
           <w:sz w:val="22"/>
         </w:rPr>
-        <w:t xml:space="preserve"> y pruebas de caja negra sobre el entorno de despliegue en producción, evaluando:</w:t>
+        <w:t xml:space="preserve"> y pruebas funcionales de caja negra sobre el entorno de despliegue en producción, evaluando:</w:t>
       </w:r>
     </w:p>
     <w:p>
@@ -1457,7 +1457,7 @@
                 <w:color w:val="1E293B"/>
                 <w:sz w:val="19"/>
               </w:rPr>
-              <w:t>Figura 3</w:t>
+              <w:t>Figura 05</w:t>
             </w:r>
           </w:p>
         </w:tc>
@@ -1607,7 +1607,7 @@
                 <w:color w:val="1E293B"/>
                 <w:sz w:val="19"/>
               </w:rPr>
-              <w:t>Figura 3</w:t>
+              <w:t>Figura 05</w:t>
             </w:r>
           </w:p>
         </w:tc>
@@ -1743,7 +1743,7 @@
                 <w:color w:val="1E293B"/>
                 <w:sz w:val="19"/>
               </w:rPr>
-              <w:t>Figura 4</w:t>
+              <w:t>Figura 06</w:t>
             </w:r>
           </w:p>
         </w:tc>
@@ -1876,7 +1876,7 @@
                 <w:color w:val="1E293B"/>
                 <w:sz w:val="19"/>
               </w:rPr>
-              <w:t>Figura 4</w:t>
+              <w:t>Figura 06</w:t>
             </w:r>
           </w:p>
         </w:tc>
@@ -2012,7 +2012,7 @@
                 <w:color w:val="1E293B"/>
                 <w:sz w:val="19"/>
               </w:rPr>
-              <w:t>Figura 5</w:t>
+              <w:t>Figura 07</w:t>
             </w:r>
           </w:p>
         </w:tc>
@@ -2145,7 +2145,7 @@
                 <w:color w:val="1E293B"/>
                 <w:sz w:val="19"/>
               </w:rPr>
-              <w:t>Figura 5</w:t>
+              <w:t>Figura 07</w:t>
             </w:r>
           </w:p>
         </w:tc>
@@ -2329,7 +2329,7 @@
                 <w:color w:val="1E293B"/>
                 <w:sz w:val="19"/>
               </w:rPr>
-              <w:t>Figuras 6 y 7</w:t>
+              <w:t>Figuras 08 y 09</w:t>
             </w:r>
           </w:p>
         </w:tc>
@@ -2462,7 +2462,7 @@
                 <w:color w:val="1E293B"/>
                 <w:sz w:val="19"/>
               </w:rPr>
-              <w:t>Figura 6</w:t>
+              <w:t>Figura 08</w:t>
             </w:r>
           </w:p>
         </w:tc>
@@ -2598,7 +2598,7 @@
                 <w:color w:val="1E293B"/>
                 <w:sz w:val="19"/>
               </w:rPr>
-              <w:t>Figura 10</w:t>
+              <w:t>Figura 12</w:t>
             </w:r>
           </w:p>
         </w:tc>
@@ -2748,7 +2748,7 @@
                 <w:color w:val="1E293B"/>
                 <w:sz w:val="19"/>
               </w:rPr>
-              <w:t>Figura 2</w:t>
+              <w:t>Figura 03</w:t>
             </w:r>
           </w:p>
         </w:tc>
@@ -2884,7 +2884,7 @@
                 <w:color w:val="1E293B"/>
                 <w:sz w:val="19"/>
               </w:rPr>
-              <w:t>Figuras 7 y 8</w:t>
+              <w:t>Figuras 09 y 10</w:t>
             </w:r>
           </w:p>
         </w:tc>
@@ -3017,7 +3017,7 @@
                 <w:color w:val="1E293B"/>
                 <w:sz w:val="19"/>
               </w:rPr>
-              <w:t>Figura 1</w:t>
+              <w:t>Figuras 01 y 02</w:t>
             </w:r>
           </w:p>
         </w:tc>
@@ -3153,7 +3153,7 @@
                 <w:color w:val="1E293B"/>
                 <w:sz w:val="19"/>
               </w:rPr>
-              <w:t>Figuras 5 y 9</w:t>
+              <w:t>Figuras 07 y 11</w:t>
             </w:r>
           </w:p>
         </w:tc>
@@ -3302,7 +3302,7 @@
                 <w:color w:val="1E293B"/>
                 <w:sz w:val="19"/>
               </w:rPr>
-              <w:t>Figura 11</w:t>
+              <w:t>Figura 13</w:t>
             </w:r>
           </w:p>
         </w:tc>
@@ -3438,7 +3438,7 @@
                 <w:color w:val="1E293B"/>
                 <w:sz w:val="19"/>
               </w:rPr>
-              <w:t>Figura 5</w:t>
+              <w:t>Figura 07</w:t>
             </w:r>
           </w:p>
         </w:tc>
@@ -3587,7 +3587,7 @@
                 <w:color w:val="1E293B"/>
                 <w:sz w:val="19"/>
               </w:rPr>
-              <w:t>Figura 5</w:t>
+              <w:t>Figura 07</w:t>
             </w:r>
           </w:p>
         </w:tc>
@@ -3740,7 +3740,7 @@
                 <w:color w:val="1E293B"/>
                 <w:sz w:val="19"/>
               </w:rPr>
-              <w:t>Figuras 3, 10 y 11</w:t>
+              <w:t>Figuras 05, 12 y 13</w:t>
             </w:r>
           </w:p>
         </w:tc>
@@ -3873,7 +3873,7 @@
                 <w:color w:val="1E293B"/>
                 <w:sz w:val="19"/>
               </w:rPr>
-              <w:t>Figuras 8 y 9</w:t>
+              <w:t>Figuras 10 y 11</w:t>
             </w:r>
           </w:p>
         </w:tc>
@@ -5706,7 +5706,7 @@
           <w:color w:val="64748B"/>
           <w:sz w:val="18"/>
         </w:rPr>
-        <w:t>Figura 1: Módulo de Autenticación y Control de Acceso con Credenciales Cifradas</w:t>
+        <w:t>Figura 01: Módulo de Autenticación y Control de Acceso</w:t>
       </w:r>
     </w:p>
     <w:p>
@@ -5720,7 +5720,7 @@
           <w:color w:val="1E293B"/>
           <w:sz w:val="22"/>
         </w:rPr>
-        <w:t>Figura 1: Interfaz de inicio de sesión con validación de credenciales del operador (`victor@leofit.com`).</w:t>
+        <w:t>Figura 01: Interfaz de inicio de sesión de LeoFit con control de acceso institucional.</w:t>
       </w:r>
     </w:p>
     <w:p>
@@ -5740,7 +5740,7 @@
               <a:graphicData uri="http://schemas.openxmlformats.org/drawingml/2006/picture">
                 <pic:pic>
                   <pic:nvPicPr>
-                    <pic:cNvPr id="0" name="01b_Login_Credenciales_Llenas.png"/>
+                    <pic:cNvPr id="0" name="02_Login_Credenciales_Llenas.png"/>
                     <pic:cNvPicPr/>
                   </pic:nvPicPr>
                   <pic:blipFill>
@@ -5775,7 +5775,7 @@
           <w:color w:val="64748B"/>
           <w:sz w:val="18"/>
         </w:rPr>
-        <w:t>Figura 1b: Formulario de Autenticación con Credenciales Cargadas</w:t>
+        <w:t>Figura 02: Formulario de Autenticación con Credenciales Cargadas</w:t>
       </w:r>
     </w:p>
     <w:p>
@@ -5789,7 +5789,7 @@
           <w:color w:val="1E293B"/>
           <w:sz w:val="22"/>
         </w:rPr>
-        <w:t>Figura 1b: Carga y verificación reactiva de credenciales antes del ingreso a la sesión protegida.</w:t>
+        <w:t>Figura 02: Carga y verificación reactiva de credenciales del operador (`victor@leofit.com`).</w:t>
       </w:r>
     </w:p>
     <w:p>
@@ -5999,7 +5999,7 @@
               <a:graphicData uri="http://schemas.openxmlformats.org/drawingml/2006/picture">
                 <pic:pic>
                   <pic:nvPicPr>
-                    <pic:cNvPr id="0" name="02_Dashboard_Control_Operativo.png"/>
+                    <pic:cNvPr id="0" name="03_Dashboard_Control_Operativo.png"/>
                     <pic:cNvPicPr/>
                   </pic:nvPicPr>
                   <pic:blipFill>
@@ -6034,7 +6034,7 @@
           <w:color w:val="64748B"/>
           <w:sz w:val="18"/>
         </w:rPr>
-        <w:t>Figura 2: Dashboard Operativo con Tarjetas Métricas y Pipeline en Tiempo Real</w:t>
+        <w:t>Figura 03: Dashboard Operativo con Tarjetas Métricas y Pipeline en Tiempo Real</w:t>
       </w:r>
     </w:p>
     <w:p>
@@ -6048,7 +6048,7 @@
           <w:color w:val="1E293B"/>
           <w:sz w:val="22"/>
         </w:rPr>
-        <w:t>Figura 2: Panel de mando con KPIs financieros, pedidos en riesgo y distribución porcentual del pipeline.</w:t>
+        <w:t>Figura 03: Panel de mando con KPIs financieros, pedidos en riesgo y distribución porcentual del pipeline.</w:t>
       </w:r>
     </w:p>
     <w:p>
@@ -6068,7 +6068,7 @@
               <a:graphicData uri="http://schemas.openxmlformats.org/drawingml/2006/picture">
                 <pic:pic>
                   <pic:nvPicPr>
-                    <pic:cNvPr id="0" name="02b_Dashboard_Privacidad_Oculta.png"/>
+                    <pic:cNvPr id="0" name="04_Dashboard_Privacidad_Oculta.png"/>
                     <pic:cNvPicPr/>
                   </pic:nvPicPr>
                   <pic:blipFill>
@@ -6103,7 +6103,7 @@
           <w:color w:val="64748B"/>
           <w:sz w:val="18"/>
         </w:rPr>
-        <w:t>Figura 2b: Activación del Modo de Privacidad Granular en Cifras Monetarias</w:t>
+        <w:t>Figura 04: Activación del Modo de Privacidad Granular en Cifras Monetarias</w:t>
       </w:r>
     </w:p>
     <w:p>
@@ -6117,7 +6117,7 @@
           <w:color w:val="1E293B"/>
           <w:sz w:val="22"/>
         </w:rPr>
-        <w:t>Figura 2b: Ocultamiento instantáneo de montos de ventas para proteger la información en mostradores públicos.</w:t>
+        <w:t>Figura 04: Ocultamiento instantáneo de montos de ventas para proteger la información en mostradores públicos.</w:t>
       </w:r>
     </w:p>
     <w:p>
@@ -6327,7 +6327,7 @@
               <a:graphicData uri="http://schemas.openxmlformats.org/drawingml/2006/picture">
                 <pic:pic>
                   <pic:nvPicPr>
-                    <pic:cNvPr id="0" name="02c_Catalogo_Busqueda_Camisetas.png"/>
+                    <pic:cNvPr id="0" name="05_Catalogo_Busqueda_Camisetas.png"/>
                     <pic:cNvPicPr/>
                   </pic:nvPicPr>
                   <pic:blipFill>
@@ -6362,7 +6362,7 @@
           <w:color w:val="64748B"/>
           <w:sz w:val="18"/>
         </w:rPr>
-        <w:t>Figura 3: Catálogo Interactivo con Búsqueda Predictiva de Prendas Deportivas</w:t>
+        <w:t>Figura 05: Catálogo Interactivo con Búsqueda Predictiva de Prendas Deportivas</w:t>
       </w:r>
     </w:p>
     <w:p>
@@ -6376,7 +6376,7 @@
           <w:color w:val="1E293B"/>
           <w:sz w:val="22"/>
         </w:rPr>
-        <w:t>Figura 3: Filtrado dinámico predictivo por texto ('Camiseta') respondiendo en menos de 80 ms.</w:t>
+        <w:t>Figura 05: Filtrado dinámico predictivo por texto ('Camiseta') respondiendo en menos de 80 ms.</w:t>
       </w:r>
     </w:p>
     <w:p>
@@ -6603,7 +6603,7 @@
               <a:graphicData uri="http://schemas.openxmlformats.org/drawingml/2006/picture">
                 <pic:pic>
                   <pic:nvPicPr>
-                    <pic:cNvPr id="0" name="03_Nuevo_Pedido_Formulario_Inicial.png"/>
+                    <pic:cNvPr id="0" name="06_Nuevo_Pedido_Formulario.png"/>
                     <pic:cNvPicPr/>
                   </pic:nvPicPr>
                   <pic:blipFill>
@@ -6638,7 +6638,7 @@
           <w:color w:val="64748B"/>
           <w:sz w:val="18"/>
         </w:rPr>
-        <w:t>Figura 4: Formulario de Registro de Nuevo Pedido y Selector de Prendas</w:t>
+        <w:t>Figura 06: Formulario de Registro de Nuevo Pedido y Selector de Prendas</w:t>
       </w:r>
     </w:p>
     <w:p>
@@ -6652,7 +6652,7 @@
           <w:color w:val="1E293B"/>
           <w:sz w:val="22"/>
         </w:rPr>
-        <w:t>Figura 4: Pantalla de nuevo pedido con selección de artículos, selector de tallas y control de cantidades.</w:t>
+        <w:t>Figura 06: Pantalla de nuevo pedido con selección de artículos, selector de tallas y control de cantidades.</w:t>
       </w:r>
     </w:p>
     <w:p>
@@ -6912,7 +6912,7 @@
               <a:graphicData uri="http://schemas.openxmlformats.org/drawingml/2006/picture">
                 <pic:pic>
                   <pic:nvPicPr>
-                    <pic:cNvPr id="0" name="04_Nuevo_Pedido_Liquidacion_Cupon_Encomienda.png"/>
+                    <pic:cNvPr id="0" name="07_Nuevo_Pedido_Liquidacion_Cupon_Encomienda.png"/>
                     <pic:cNvPicPr/>
                   </pic:nvPicPr>
                   <pic:blipFill>
@@ -6947,7 +6947,7 @@
           <w:color w:val="64748B"/>
           <w:sz w:val="18"/>
         </w:rPr>
-        <w:t>Figura 5: Liquidación con Despacho por Encomienda, Validación de DNI y Cupón Aplicado</w:t>
+        <w:t>Figura 07: Liquidación con Despacho por Encomienda, Validación de DNI y Cupón Aplicado</w:t>
       </w:r>
     </w:p>
     <w:p>
@@ -6961,7 +6961,7 @@
           <w:color w:val="1E293B"/>
           <w:sz w:val="22"/>
         </w:rPr>
-        <w:t>Figura 5: Registro completo con cliente, teléfono, DNI, dirección, agencia Shalom, flete interprovincial y descuento del 10%.</w:t>
+        <w:t>Figura 07: Registro completo con cliente, teléfono, DNI, dirección, agencia Shalom, flete interprovincial y descuento del 10%.</w:t>
       </w:r>
     </w:p>
     <w:p>
@@ -7234,7 +7234,7 @@
               <a:graphicData uri="http://schemas.openxmlformats.org/drawingml/2006/picture">
                 <pic:pic>
                   <pic:nvPicPr>
-                    <pic:cNvPr id="0" name="05_Bandeja_Gestion_Pedidos.png"/>
+                    <pic:cNvPr id="0" name="08_Bandeja_Gestion_Pedidos.png"/>
                     <pic:cNvPicPr/>
                   </pic:nvPicPr>
                   <pic:blipFill>
@@ -7269,7 +7269,7 @@
           <w:color w:val="64748B"/>
           <w:sz w:val="18"/>
         </w:rPr>
-        <w:t>Figura 6: Bandeja Centralizada de Gestión de Pedidos con Filtros por Estado</w:t>
+        <w:t>Figura 08: Bandeja Centralizada de Gestión de Pedidos con Filtros por Estado</w:t>
       </w:r>
     </w:p>
     <w:p>
@@ -7283,7 +7283,7 @@
           <w:color w:val="1E293B"/>
           <w:sz w:val="22"/>
         </w:rPr>
-        <w:t>Figura 6: Vista general de órdenes registradas con buscador, estadísticas rápidas y chips de filtrado.</w:t>
+        <w:t>Figura 08: Vista general de órdenes registradas con buscador, estadísticas rápidas y chips de filtrado.</w:t>
       </w:r>
     </w:p>
     <w:p>
@@ -7493,7 +7493,7 @@
               <a:graphicData uri="http://schemas.openxmlformats.org/drawingml/2006/picture">
                 <pic:pic>
                   <pic:nvPicPr>
-                    <pic:cNvPr id="0" name="06_Detalle_Pedido_Acordeon.png"/>
+                    <pic:cNvPr id="0" name="09_Detalle_Pedido_Acordeon.png"/>
                     <pic:cNvPicPr/>
                   </pic:nvPicPr>
                   <pic:blipFill>
@@ -7528,7 +7528,7 @@
           <w:color w:val="64748B"/>
           <w:sz w:val="18"/>
         </w:rPr>
-        <w:t>Figura 7: Detalle Completo de Orden con Desglose Financiero y Trazabilidad</w:t>
+        <w:t>Figura 09: Detalle Completo de Orden con Desglose Financiero y Trazabilidad</w:t>
       </w:r>
     </w:p>
     <w:p>
@@ -7542,7 +7542,7 @@
           <w:color w:val="1E293B"/>
           <w:sz w:val="22"/>
         </w:rPr>
-        <w:t>Figura 7: Acordeón expandido con desglose de prendas, canal, método de pago y acciones operativas.</w:t>
+        <w:t>Figura 09: Acordeón expandido con desglose de prendas, canal, método de pago y acciones operativas.</w:t>
       </w:r>
     </w:p>
     <w:p>
@@ -7735,7 +7735,7 @@
               <a:graphicData uri="http://schemas.openxmlformats.org/drawingml/2006/picture">
                 <pic:pic>
                   <pic:nvPicPr>
-                    <pic:cNvPr id="0" name="07_Comprobante_Digital_Recibo.png"/>
+                    <pic:cNvPr id="0" name="10_Comprobante_Digital_Recibo.png"/>
                     <pic:cNvPicPr/>
                   </pic:nvPicPr>
                   <pic:blipFill>
@@ -7770,7 +7770,7 @@
           <w:color w:val="64748B"/>
           <w:sz w:val="18"/>
         </w:rPr>
-        <w:t>Figura 8: Modal de Comprobante Digital Oficial con Descarga PDF e Impresión</w:t>
+        <w:t>Figura 10: Modal de Comprobante Digital Oficial con Descarga PDF e Impresión</w:t>
       </w:r>
     </w:p>
     <w:p>
@@ -7784,7 +7784,7 @@
           <w:color w:val="1E293B"/>
           <w:sz w:val="22"/>
         </w:rPr>
-        <w:t>Figura 8: Recibo digital oficial estructurado conforme a la identidad de marca LeoFit Solutions E.I.R.L.</w:t>
+        <w:t>Figura 10: Recibo digital oficial estructurado conforme a la identidad de marca LeoFit Solutions E.I.R.L.</w:t>
       </w:r>
     </w:p>
     <w:p>
@@ -7977,7 +7977,7 @@
               <a:graphicData uri="http://schemas.openxmlformats.org/drawingml/2006/picture">
                 <pic:pic>
                   <pic:nvPicPr>
-                    <pic:cNvPr id="0" name="08_Comprobante_Rotulo_Encomienda.png"/>
+                    <pic:cNvPr id="0" name="11_Comprobante_Rotulo_Encomienda.png"/>
                     <pic:cNvPicPr/>
                   </pic:nvPicPr>
                   <pic:blipFill>
@@ -8012,7 +8012,7 @@
           <w:color w:val="64748B"/>
           <w:sz w:val="18"/>
         </w:rPr>
-        <w:t>Figura 9: Rótulo de Despacho Estandarizado para Agencia de Encomienda (Shalom)</w:t>
+        <w:t>Figura 11: Rótulo de Despacho Estandarizado para Agencia de Encomienda (Shalom)</w:t>
       </w:r>
     </w:p>
     <w:p>
@@ -8026,7 +8026,7 @@
           <w:color w:val="1E293B"/>
           <w:sz w:val="22"/>
         </w:rPr>
-        <w:t>Figura 9: Rótulo logístico estandarizado con formato térmico listo para pegar en el embalaje de encomienda.</w:t>
+        <w:t>Figura 11: Rótulo logístico estandarizado con formato térmico listo para pegar en el embalaje de encomienda.</w:t>
       </w:r>
     </w:p>
     <w:p>
@@ -8236,7 +8236,7 @@
               <a:graphicData uri="http://schemas.openxmlformats.org/drawingml/2006/picture">
                 <pic:pic>
                   <pic:nvPicPr>
-                    <pic:cNvPr id="0" name="09_Gestion_Inventario_Stock.png"/>
+                    <pic:cNvPr id="0" name="12_Gestion_Inventario_Stock.png"/>
                     <pic:cNvPicPr/>
                   </pic:nvPicPr>
                   <pic:blipFill>
@@ -8271,7 +8271,7 @@
           <w:color w:val="64748B"/>
           <w:sz w:val="18"/>
         </w:rPr>
-        <w:t>Figura 10: Panel de Gestión de Inventario Físico con Alertas de Stock Bajo</w:t>
+        <w:t>Figura 12: Panel de Gestión de Inventario Físico con Alertas de Stock Bajo</w:t>
       </w:r>
     </w:p>
     <w:p>
@@ -8285,7 +8285,7 @@
           <w:color w:val="1E293B"/>
           <w:sz w:val="22"/>
         </w:rPr>
-        <w:t>Figura 10: Control de existencias con alertas automáticas de reposición para el taller de confección.</w:t>
+        <w:t>Figura 12: Control de existencias con alertas automáticas de reposición para el taller de confección.</w:t>
       </w:r>
     </w:p>
     <w:p>
@@ -8511,7 +8511,7 @@
               <a:graphicData uri="http://schemas.openxmlformats.org/drawingml/2006/picture">
                 <pic:pic>
                   <pic:nvPicPr>
-                    <pic:cNvPr id="0" name="10b_Portal_Rastreo_Resultado_Timeline.png"/>
+                    <pic:cNvPr id="0" name="13_Portal_Rastreo_Timeline.png"/>
                     <pic:cNvPicPr/>
                   </pic:nvPicPr>
                   <pic:blipFill>
@@ -8546,7 +8546,7 @@
           <w:color w:val="64748B"/>
           <w:sz w:val="18"/>
         </w:rPr>
-        <w:t>Figura 11: Portal Público de Rastreo en Vivo con Timeline y Datos de Despacho</w:t>
+        <w:t>Figura 13: Portal Público de Rastreo en Vivo con Timeline y Datos de Despacho</w:t>
       </w:r>
     </w:p>
     <w:p>
@@ -8560,7 +8560,7 @@
           <w:color w:val="1E293B"/>
           <w:sz w:val="22"/>
         </w:rPr>
-        <w:t>Figura 11: Rastreo en vivo de orden interprovincial con timeline de 4 fases y datos de courier asignado.</w:t>
+        <w:t>Figura 13: Rastreo en vivo de orden interprovincial con timeline de 4 fases y datos de courier asignado.</w:t>
       </w:r>
     </w:p>
     <w:p>
@@ -8786,7 +8786,7 @@
               <a:graphicData uri="http://schemas.openxmlformats.org/drawingml/2006/picture">
                 <pic:pic>
                   <pic:nvPicPr>
-                    <pic:cNvPr id="0" name="11_Modo_Accesible_Alto_Contraste.png"/>
+                    <pic:cNvPr id="0" name="14_Modo_Accesible_Alto_Contraste.png"/>
                     <pic:cNvPicPr/>
                   </pic:nvPicPr>
                   <pic:blipFill>
@@ -8821,7 +8821,7 @@
           <w:color w:val="64748B"/>
           <w:sz w:val="18"/>
         </w:rPr>
-        <w:t>Figura 12: Modo Accesible de Alto Contraste y Tipografía Agrandada (A11y)</w:t>
+        <w:t>Figura 14: Modo Accesible de Alto Contraste y Tipografía Agrandada (A11y)</w:t>
       </w:r>
     </w:p>
     <w:p>
@@ -8835,7 +8835,7 @@
           <w:color w:val="1E293B"/>
           <w:sz w:val="22"/>
         </w:rPr>
-        <w:t>Figura 12: Interfaz adaptada con contraste reforzado y escalado ergonómico de fuentes.</w:t>
+        <w:t>Figura 14: Interfaz adaptada con contraste reforzado y escalado ergonómico de fuentes.</w:t>
       </w:r>
     </w:p>
     <w:p>
@@ -9191,7 +9191,7 @@
                 <w:color w:val="1E293B"/>
                 <w:sz w:val="19"/>
               </w:rPr>
-              <w:t>Figura 3</w:t>
+              <w:t>Figura 05</w:t>
             </w:r>
           </w:p>
         </w:tc>
@@ -9323,7 +9323,7 @@
                 <w:color w:val="1E293B"/>
                 <w:sz w:val="19"/>
               </w:rPr>
-              <w:t>Figura 3</w:t>
+              <w:t>Figura 05</w:t>
             </w:r>
           </w:p>
         </w:tc>
@@ -9458,7 +9458,7 @@
                 <w:color w:val="1E293B"/>
                 <w:sz w:val="19"/>
               </w:rPr>
-              <w:t>Figura 4</w:t>
+              <w:t>Figura 06</w:t>
             </w:r>
           </w:p>
         </w:tc>
@@ -9590,7 +9590,7 @@
                 <w:color w:val="1E293B"/>
                 <w:sz w:val="19"/>
               </w:rPr>
-              <w:t>Figura 4</w:t>
+              <w:t>Figura 06</w:t>
             </w:r>
           </w:p>
         </w:tc>
@@ -9725,7 +9725,7 @@
                 <w:color w:val="1E293B"/>
                 <w:sz w:val="19"/>
               </w:rPr>
-              <w:t>Figura 5</w:t>
+              <w:t>Figura 07</w:t>
             </w:r>
           </w:p>
         </w:tc>
@@ -9857,7 +9857,7 @@
                 <w:color w:val="1E293B"/>
                 <w:sz w:val="19"/>
               </w:rPr>
-              <w:t>Figura 5</w:t>
+              <w:t>Figura 07</w:t>
             </w:r>
           </w:p>
         </w:tc>
@@ -9992,7 +9992,7 @@
                 <w:color w:val="1E293B"/>
                 <w:sz w:val="19"/>
               </w:rPr>
-              <w:t>Figuras 6 y 7</w:t>
+              <w:t>Figuras 08 y 09</w:t>
             </w:r>
           </w:p>
         </w:tc>
@@ -10124,7 +10124,7 @@
                 <w:color w:val="1E293B"/>
                 <w:sz w:val="19"/>
               </w:rPr>
-              <w:t>Figura 6</w:t>
+              <w:t>Figura 08</w:t>
             </w:r>
           </w:p>
         </w:tc>
@@ -10259,7 +10259,7 @@
                 <w:color w:val="1E293B"/>
                 <w:sz w:val="19"/>
               </w:rPr>
-              <w:t>Figura 10</w:t>
+              <w:t>Figura 12</w:t>
             </w:r>
           </w:p>
         </w:tc>
@@ -10391,7 +10391,7 @@
                 <w:color w:val="1E293B"/>
                 <w:sz w:val="19"/>
               </w:rPr>
-              <w:t>Figura 2</w:t>
+              <w:t>Figura 03</w:t>
             </w:r>
           </w:p>
         </w:tc>
@@ -10526,7 +10526,7 @@
                 <w:color w:val="1E293B"/>
                 <w:sz w:val="19"/>
               </w:rPr>
-              <w:t>Figuras 7 y 8</w:t>
+              <w:t>Figuras 09 y 10</w:t>
             </w:r>
           </w:p>
         </w:tc>
@@ -10658,7 +10658,7 @@
                 <w:color w:val="1E293B"/>
                 <w:sz w:val="19"/>
               </w:rPr>
-              <w:t>Figura 1</w:t>
+              <w:t>Figuras 01 y 02</w:t>
             </w:r>
           </w:p>
         </w:tc>
@@ -10793,7 +10793,7 @@
                 <w:color w:val="1E293B"/>
                 <w:sz w:val="19"/>
               </w:rPr>
-              <w:t>Figuras 5 y 9</w:t>
+              <w:t>Figuras 07 y 11</w:t>
             </w:r>
           </w:p>
         </w:tc>
@@ -10925,7 +10925,7 @@
                 <w:color w:val="1E293B"/>
                 <w:sz w:val="19"/>
               </w:rPr>
-              <w:t>Figura 11</w:t>
+              <w:t>Figura 13</w:t>
             </w:r>
           </w:p>
         </w:tc>
@@ -11060,7 +11060,7 @@
                 <w:color w:val="1E293B"/>
                 <w:sz w:val="19"/>
               </w:rPr>
-              <w:t>Figura 5</w:t>
+              <w:t>Figura 07</w:t>
             </w:r>
           </w:p>
         </w:tc>
@@ -11192,7 +11192,7 @@
                 <w:color w:val="1E293B"/>
                 <w:sz w:val="19"/>
               </w:rPr>
-              <w:t>Figura 5</w:t>
+              <w:t>Figura 07</w:t>
             </w:r>
           </w:p>
         </w:tc>
@@ -11327,7 +11327,7 @@
                 <w:color w:val="1E293B"/>
                 <w:sz w:val="19"/>
               </w:rPr>
-              <w:t>Figuras 3, 10 y 11</w:t>
+              <w:t>Figuras 05, 12 y 13</w:t>
             </w:r>
           </w:p>
         </w:tc>
@@ -11459,7 +11459,7 @@
                 <w:color w:val="1E293B"/>
                 <w:sz w:val="19"/>
               </w:rPr>
-              <w:t>Figuras 8 y 9</w:t>
+              <w:t>Figuras 10 y 11</w:t>
             </w:r>
           </w:p>
         </w:tc>
@@ -11594,7 +11594,7 @@
                 <w:color w:val="1E293B"/>
                 <w:sz w:val="19"/>
               </w:rPr>
-              <w:t>Figuras 4 y 12</w:t>
+              <w:t>Figuras 06 y 14</w:t>
             </w:r>
           </w:p>
         </w:tc>
@@ -11726,7 +11726,7 @@
                 <w:color w:val="1E293B"/>
                 <w:sz w:val="19"/>
               </w:rPr>
-              <w:t>Figura 3</w:t>
+              <w:t>Figura 05</w:t>
             </w:r>
           </w:p>
         </w:tc>
@@ -11861,7 +11861,7 @@
                 <w:color w:val="1E293B"/>
                 <w:sz w:val="19"/>
               </w:rPr>
-              <w:t>Figuras 6 y 7</w:t>
+              <w:t>Figuras 08 y 09</w:t>
             </w:r>
           </w:p>
         </w:tc>
@@ -11993,7 +11993,7 @@
                 <w:color w:val="1E293B"/>
                 <w:sz w:val="19"/>
               </w:rPr>
-              <w:t>Figuras 1 y 2b</w:t>
+              <w:t>Figuras 01 y 04</w:t>
             </w:r>
           </w:p>
         </w:tc>
@@ -12128,7 +12128,7 @@
                 <w:color w:val="1E293B"/>
                 <w:sz w:val="19"/>
               </w:rPr>
-              <w:t>Figura 12</w:t>
+              <w:t>Figura 14</w:t>
             </w:r>
           </w:p>
         </w:tc>

</xml_diff>